<commit_message>
feat(T-37): bộ sinh Word dùng Content Control, template .docx thật và lớp dữ liệu mẫu
- DocxTemplateEngine viết lại: điền theo Content Control (Tag) thay vì tìm/thay {{TAG}} theo run; hỗ trợ trường đơn, khối lặp repeat:, khối điều kiện if:/ifnot:; chữ mặc định nằm trong template. Bỏ các hàm CreateMasterMau* và việc tự sinh phôi.
- Chuyển 5 template (01, 02, 10, 11, 13) sang Content Control, giữ nguyên bố cục/nội dung; sửa các chỗ gắn nhầm trường (Đơn vị công tác, 9 ô điểm Mẫu 10, cột 4a/4b Mẫu 11, phiếu không hợp lệ Mẫu 13).
- Mỗi mẫu một lớp dữ liệu (Documents/Forms) dựng từ dữ liệu đã lưu; template đọc qua IWordTemplateStore (Documents:TemplatePath).
- Hết warning nullable trong DocxTemplateEngine (T-39).
- Tài liệu docs/bieu-mau.md.
</commit_message>
<xml_diff>
--- a/backend/src/CongTacDang.Infrastructure/Templates/Word/Mau_01_PhieuGiaoNhiemVu.docx
+++ b/backend/src/CongTacDang.Infrastructure/Templates/Word/Mau_01_PhieuGiaoNhiemVu.docx
@@ -75,8 +75,23 @@
                 <w:sz w:val="24"/>
               </w:rPr>
               <w:br/>
-              <w:t>{{DEPARTMENT}}</w:t>
             </w:r>
+            <w:sdt>
+              <w:sdtPr>
+                <w:alias w:val="DEPARTMENT"/>
+                <w:tag w:val="DEPARTMENT"/>
+                <w:id w:val="510000"/>
+              </w:sdtPr>
+              <w:sdtContent>
+                <w:r>
+                  <w:rPr>
+                    <w:b/>
+                    <w:sz w:val="24"/>
+                  </w:rPr>
+                  <w:t xml:space="preserve">................</w:t>
+                </w:r>
+              </w:sdtContent>
+            </w:sdt>
           </w:p>
         </w:tc>
         <w:tc>
@@ -179,8 +194,44 @@
         <w:rPr>
           <w:sz w:val="24"/>
         </w:rPr>
-        <w:t>Kỳ đánh giá: Quý {{QUARTER}} / Năm {{YEAR}}</w:t>
+        <w:t xml:space="preserve">Kỳ đánh giá: Quý </w:t>
       </w:r>
+      <w:sdt>
+        <w:sdtPr>
+          <w:alias w:val="QUARTER"/>
+          <w:tag w:val="QUARTER"/>
+          <w:id w:val="510001"/>
+        </w:sdtPr>
+        <w:sdtContent>
+          <w:r>
+            <w:rPr>
+              <w:sz w:val="24"/>
+            </w:rPr>
+            <w:t xml:space="preserve">...</w:t>
+          </w:r>
+        </w:sdtContent>
+      </w:sdt>
+      <w:r>
+        <w:rPr>
+          <w:sz w:val="24"/>
+        </w:rPr>
+        <w:t xml:space="preserve"> / Năm </w:t>
+      </w:r>
+      <w:sdt>
+        <w:sdtPr>
+          <w:alias w:val="YEAR"/>
+          <w:tag w:val="YEAR"/>
+          <w:id w:val="510002"/>
+        </w:sdtPr>
+        <w:sdtContent>
+          <w:r>
+            <w:rPr>
+              <w:sz w:val="24"/>
+            </w:rPr>
+            <w:t xml:space="preserve">20...</w:t>
+          </w:r>
+        </w:sdtContent>
+      </w:sdt>
     </w:p>
     <w:p>
       <w:pPr>
@@ -194,7 +245,28 @@
         <w:rPr>
           <w:sz w:val="24"/>
         </w:rPr>
-        <w:t>Họ và tên cán bộ: {{FULL_NAME}}  Mã số cán bộ: ……………………</w:t>
+        <w:t xml:space="preserve">Họ và tên cán bộ: </w:t>
+      </w:r>
+      <w:sdt>
+        <w:sdtPr>
+          <w:alias w:val="FULL_NAME"/>
+          <w:tag w:val="FULL_NAME"/>
+          <w:id w:val="510003"/>
+        </w:sdtPr>
+        <w:sdtContent>
+          <w:r>
+            <w:rPr>
+              <w:sz w:val="24"/>
+            </w:rPr>
+            <w:t xml:space="preserve">................................</w:t>
+          </w:r>
+        </w:sdtContent>
+      </w:sdt>
+      <w:r>
+        <w:rPr>
+          <w:sz w:val="24"/>
+        </w:rPr>
+        <w:t xml:space="preserve">  Mã số cán bộ: ……………………</w:t>
       </w:r>
       <w:r>
         <w:rPr>
@@ -213,19 +285,76 @@
         <w:rPr>
           <w:sz w:val="24"/>
         </w:rPr>
-        <w:t>Chức danh /Vị trí công tác: {{POSITION}}  Đơn vị công tác: {{DEPARTMENT}}</w:t>
+        <w:t xml:space="preserve">Chức danh /Vị trí công tác: </w:t>
       </w:r>
-    </w:p>
-    <w:p>
-      <w:pPr>
-        <w:spacing w:after="40" w:line="240" w:lineRule="auto"/>
-        <w:ind w:firstLine="720"/>
-      </w:pPr>
+      <w:sdt>
+        <w:sdtPr>
+          <w:alias w:val="POSITION"/>
+          <w:tag w:val="POSITION"/>
+          <w:id w:val="510004"/>
+        </w:sdtPr>
+        <w:sdtContent>
+          <w:r>
+            <w:rPr>
+              <w:sz w:val="24"/>
+            </w:rPr>
+            <w:t xml:space="preserve">................</w:t>
+          </w:r>
+        </w:sdtContent>
+      </w:sdt>
       <w:r>
         <w:rPr>
           <w:sz w:val="24"/>
         </w:rPr>
-        <w:t>Người quản lý trực tiếp: {{SUPERVISOR_NAME}}  Chức vụ: ………………………………………</w:t>
+        <w:t xml:space="preserve">  Đơn vị công tác: </w:t>
+      </w:r>
+      <w:sdt>
+        <w:sdtPr>
+          <w:alias w:val="DEPARTMENT"/>
+          <w:tag w:val="DEPARTMENT"/>
+          <w:id w:val="510005"/>
+        </w:sdtPr>
+        <w:sdtContent>
+          <w:r>
+            <w:rPr>
+              <w:sz w:val="24"/>
+            </w:rPr>
+            <w:t xml:space="preserve">................</w:t>
+          </w:r>
+        </w:sdtContent>
+      </w:sdt>
+    </w:p>
+    <w:p>
+      <w:pPr>
+        <w:spacing w:after="40" w:line="240" w:lineRule="auto"/>
+        <w:ind w:firstLine="720"/>
+      </w:pPr>
+      <w:r>
+        <w:rPr>
+          <w:sz w:val="24"/>
+        </w:rPr>
+        <w:t xml:space="preserve">Người quản lý trực tiếp: </w:t>
+      </w:r>
+      <w:sdt>
+        <w:sdtPr>
+          <w:alias w:val="SUPERVISOR_NAME"/>
+          <w:tag w:val="SUPERVISOR_NAME"/>
+          <w:id w:val="510006"/>
+        </w:sdtPr>
+        <w:sdtContent>
+          <w:r>
+            <w:rPr>
+              <w:sz w:val="24"/>
+            </w:rPr>
+            <w:t xml:space="preserve">................................</w:t>
+          </w:r>
+        </w:sdtContent>
+      </w:sdt>
+      <w:r>
+        <w:rPr>
+          <w:sz w:val="24"/>
+        </w:rPr>
+        <w:t xml:space="preserve">  Chức vụ: ………………………………………</w:t>
       </w:r>
     </w:p>
     <w:p>
@@ -658,247 +787,355 @@
           </w:p>
         </w:tc>
       </w:tr>
-      <w:tr>
-        <w:trPr>
-          <w:cantSplit/>
-          <w:jc w:val="center"/>
-        </w:trPr>
-        <w:tc>
-          <w:tcPr>
-            <w:tcW w:w="1087" w:type="dxa"/>
-            <w:tcMar>
-              <w:top w:w="28" w:type="dxa"/>
-              <w:left w:w="38" w:type="dxa"/>
-              <w:bottom w:w="28" w:type="dxa"/>
-              <w:right w:w="38" w:type="dxa"/>
-            </w:tcMar>
-            <w:vAlign w:val="center"/>
-          </w:tcPr>
-          <w:p>
-            <w:r>
-              <w:rPr>
-                <w:rFonts w:ascii="Times New Roman" w:hAnsi="Times New Roman"/>
-                <w:sz w:val="20"/>
-              </w:rPr>
-              <w:t>{{T_STT}}</w:t>
-            </w:r>
-          </w:p>
-        </w:tc>
-        <w:tc>
-          <w:tcPr>
-            <w:tcW w:w="2022" w:type="dxa"/>
-            <w:tcMar>
-              <w:top w:w="28" w:type="dxa"/>
-              <w:left w:w="38" w:type="dxa"/>
-              <w:bottom w:w="28" w:type="dxa"/>
-              <w:right w:w="38" w:type="dxa"/>
-            </w:tcMar>
-            <w:vAlign w:val="center"/>
-          </w:tcPr>
-          <w:p>
-            <w:r>
-              <w:rPr>
-                <w:rFonts w:ascii="Times New Roman" w:hAnsi="Times New Roman"/>
-                <w:sz w:val="20"/>
-              </w:rPr>
-              <w:t>{{T_NAME}}</w:t>
-            </w:r>
-          </w:p>
-        </w:tc>
-        <w:tc>
-          <w:tcPr>
-            <w:tcW w:w="1348" w:type="dxa"/>
-            <w:gridSpan w:val="2"/>
-            <w:tcMar>
-              <w:top w:w="28" w:type="dxa"/>
-              <w:left w:w="38" w:type="dxa"/>
-              <w:bottom w:w="28" w:type="dxa"/>
-              <w:right w:w="38" w:type="dxa"/>
-            </w:tcMar>
-            <w:vAlign w:val="center"/>
-          </w:tcPr>
-          <w:p>
-            <w:r>
-              <w:rPr>
-                <w:rFonts w:ascii="Times New Roman" w:hAnsi="Times New Roman"/>
-                <w:sz w:val="20"/>
-              </w:rPr>
-              <w:t>{{T_CODE}}</w:t>
-            </w:r>
-          </w:p>
-        </w:tc>
-        <w:tc>
-          <w:tcPr>
-            <w:tcW w:w="1347" w:type="dxa"/>
-            <w:tcMar>
-              <w:top w:w="28" w:type="dxa"/>
-              <w:left w:w="38" w:type="dxa"/>
-              <w:bottom w:w="28" w:type="dxa"/>
-              <w:right w:w="38" w:type="dxa"/>
-            </w:tcMar>
-            <w:vAlign w:val="center"/>
-          </w:tcPr>
-          <w:p>
-            <w:r>
-              <w:rPr>
-                <w:rFonts w:ascii="Times New Roman" w:hAnsi="Times New Roman"/>
-                <w:sz w:val="20"/>
-              </w:rPr>
-              <w:t>{{T_AXIS}}</w:t>
-            </w:r>
-          </w:p>
-        </w:tc>
-        <w:tc>
-          <w:tcPr>
-            <w:tcW w:w="1347" w:type="dxa"/>
-            <w:tcMar>
-              <w:top w:w="28" w:type="dxa"/>
-              <w:left w:w="38" w:type="dxa"/>
-              <w:bottom w:w="28" w:type="dxa"/>
-              <w:right w:w="38" w:type="dxa"/>
-            </w:tcMar>
-            <w:vAlign w:val="center"/>
-          </w:tcPr>
-          <w:p>
-            <w:r>
-              <w:rPr>
-                <w:rFonts w:ascii="Times New Roman" w:hAnsi="Times New Roman"/>
-                <w:sz w:val="20"/>
-              </w:rPr>
-              <w:t>{{T_ROLE}}</w:t>
-            </w:r>
-          </w:p>
-        </w:tc>
-        <w:tc>
-          <w:tcPr>
-            <w:tcW w:w="1347" w:type="dxa"/>
-            <w:gridSpan w:val="2"/>
-            <w:tcMar>
-              <w:top w:w="28" w:type="dxa"/>
-              <w:left w:w="38" w:type="dxa"/>
-              <w:bottom w:w="28" w:type="dxa"/>
-              <w:right w:w="38" w:type="dxa"/>
-            </w:tcMar>
-            <w:vAlign w:val="center"/>
-          </w:tcPr>
-          <w:p>
-            <w:r>
-              <w:rPr>
-                <w:rFonts w:ascii="Times New Roman" w:hAnsi="Times New Roman"/>
-                <w:sz w:val="20"/>
-              </w:rPr>
-              <w:t>{{T_WEIGHT}}</w:t>
-            </w:r>
-          </w:p>
-        </w:tc>
-        <w:tc>
-          <w:tcPr>
-            <w:tcW w:w="1347" w:type="dxa"/>
-            <w:tcMar>
-              <w:top w:w="28" w:type="dxa"/>
-              <w:left w:w="38" w:type="dxa"/>
-              <w:bottom w:w="28" w:type="dxa"/>
-              <w:right w:w="38" w:type="dxa"/>
-            </w:tcMar>
-            <w:vAlign w:val="center"/>
-          </w:tcPr>
-          <w:p>
-            <w:r>
-              <w:rPr>
-                <w:rFonts w:ascii="Times New Roman" w:hAnsi="Times New Roman"/>
-                <w:sz w:val="20"/>
-              </w:rPr>
-              <w:t>{{T_DEADLINE}}</w:t>
-            </w:r>
-          </w:p>
-        </w:tc>
-        <w:tc>
-          <w:tcPr>
-            <w:tcW w:w="1463" w:type="dxa"/>
-            <w:tcMar>
-              <w:top w:w="28" w:type="dxa"/>
-              <w:left w:w="38" w:type="dxa"/>
-              <w:bottom w:w="28" w:type="dxa"/>
-              <w:right w:w="38" w:type="dxa"/>
-            </w:tcMar>
-            <w:vAlign w:val="center"/>
-          </w:tcPr>
-          <w:p>
-            <w:r>
-              <w:rPr>
-                <w:rFonts w:ascii="Times New Roman" w:hAnsi="Times New Roman"/>
-                <w:sz w:val="20"/>
-              </w:rPr>
-              <w:t>{{T_STANDARD}}</w:t>
-            </w:r>
-          </w:p>
-        </w:tc>
-        <w:tc>
-          <w:tcPr>
-            <w:tcW w:w="1395" w:type="dxa"/>
-            <w:gridSpan w:val="2"/>
-            <w:tcMar>
-              <w:top w:w="28" w:type="dxa"/>
-              <w:left w:w="38" w:type="dxa"/>
-              <w:bottom w:w="28" w:type="dxa"/>
-              <w:right w:w="38" w:type="dxa"/>
-            </w:tcMar>
-            <w:vAlign w:val="center"/>
-          </w:tcPr>
-          <w:p>
-            <w:r>
-              <w:rPr>
-                <w:rFonts w:ascii="Times New Roman" w:hAnsi="Times New Roman"/>
-                <w:sz w:val="20"/>
-              </w:rPr>
-              <w:t>{{T_EXCEED}}</w:t>
-            </w:r>
-          </w:p>
-        </w:tc>
-        <w:tc>
-          <w:tcPr>
-            <w:tcW w:w="1347" w:type="dxa"/>
-            <w:tcMar>
-              <w:top w:w="28" w:type="dxa"/>
-              <w:left w:w="38" w:type="dxa"/>
-              <w:bottom w:w="28" w:type="dxa"/>
-              <w:right w:w="38" w:type="dxa"/>
-            </w:tcMar>
-            <w:vAlign w:val="center"/>
-          </w:tcPr>
-          <w:p>
-            <w:r>
-              <w:rPr>
-                <w:rFonts w:ascii="Times New Roman" w:hAnsi="Times New Roman"/>
-                <w:sz w:val="20"/>
-              </w:rPr>
-              <w:t>{{T_EVIDENCE}}</w:t>
-            </w:r>
-          </w:p>
-        </w:tc>
-        <w:tc>
-          <w:tcPr>
-            <w:tcW w:w="1348" w:type="dxa"/>
-            <w:gridSpan w:val="2"/>
-            <w:tcMar>
-              <w:top w:w="28" w:type="dxa"/>
-              <w:left w:w="38" w:type="dxa"/>
-              <w:bottom w:w="28" w:type="dxa"/>
-              <w:right w:w="38" w:type="dxa"/>
-            </w:tcMar>
-            <w:vAlign w:val="center"/>
-          </w:tcPr>
-          <w:p>
-            <w:r>
-              <w:rPr>
-                <w:rFonts w:ascii="Times New Roman" w:hAnsi="Times New Roman"/>
-                <w:sz w:val="20"/>
-              </w:rPr>
-              <w:t>{{T_SIGNER}}</w:t>
-            </w:r>
-          </w:p>
-        </w:tc>
-      </w:tr>
+      <w:sdt>
+        <w:sdtPr>
+          <w:alias w:val="repeat:TASKS"/>
+          <w:tag w:val="repeat:TASKS"/>
+          <w:id w:val="510018"/>
+        </w:sdtPr>
+        <w:sdtContent>
+          <w:tr>
+            <w:trPr>
+              <w:cantSplit/>
+              <w:jc w:val="center"/>
+            </w:trPr>
+            <w:tc>
+              <w:tcPr>
+                <w:tcW w:w="1087" w:type="dxa"/>
+                <w:tcMar>
+                  <w:top w:w="28" w:type="dxa"/>
+                  <w:left w:w="38" w:type="dxa"/>
+                  <w:bottom w:w="28" w:type="dxa"/>
+                  <w:right w:w="38" w:type="dxa"/>
+                </w:tcMar>
+                <w:vAlign w:val="center"/>
+              </w:tcPr>
+              <w:p>
+                <w:sdt>
+                  <w:sdtPr>
+                    <w:alias w:val="T_STT"/>
+                    <w:tag w:val="T_STT"/>
+                    <w:id w:val="510007"/>
+                  </w:sdtPr>
+                  <w:sdtContent>
+                    <w:r>
+                      <w:rPr>
+                        <w:rFonts w:ascii="Times New Roman" w:hAnsi="Times New Roman"/>
+                        <w:sz w:val="20"/>
+                      </w:rPr>
+                      <w:t xml:space="preserve">«T_STT»</w:t>
+                    </w:r>
+                  </w:sdtContent>
+                </w:sdt>
+              </w:p>
+            </w:tc>
+            <w:tc>
+              <w:tcPr>
+                <w:tcW w:w="2022" w:type="dxa"/>
+                <w:tcMar>
+                  <w:top w:w="28" w:type="dxa"/>
+                  <w:left w:w="38" w:type="dxa"/>
+                  <w:bottom w:w="28" w:type="dxa"/>
+                  <w:right w:w="38" w:type="dxa"/>
+                </w:tcMar>
+                <w:vAlign w:val="center"/>
+              </w:tcPr>
+              <w:p>
+                <w:sdt>
+                  <w:sdtPr>
+                    <w:alias w:val="T_NAME"/>
+                    <w:tag w:val="T_NAME"/>
+                    <w:id w:val="510008"/>
+                  </w:sdtPr>
+                  <w:sdtContent>
+                    <w:r>
+                      <w:rPr>
+                        <w:rFonts w:ascii="Times New Roman" w:hAnsi="Times New Roman"/>
+                        <w:sz w:val="20"/>
+                      </w:rPr>
+                      <w:t xml:space="preserve">«T_NAME»</w:t>
+                    </w:r>
+                  </w:sdtContent>
+                </w:sdt>
+              </w:p>
+            </w:tc>
+            <w:tc>
+              <w:tcPr>
+                <w:tcW w:w="1348" w:type="dxa"/>
+                <w:gridSpan w:val="2"/>
+                <w:tcMar>
+                  <w:top w:w="28" w:type="dxa"/>
+                  <w:left w:w="38" w:type="dxa"/>
+                  <w:bottom w:w="28" w:type="dxa"/>
+                  <w:right w:w="38" w:type="dxa"/>
+                </w:tcMar>
+                <w:vAlign w:val="center"/>
+              </w:tcPr>
+              <w:p>
+                <w:sdt>
+                  <w:sdtPr>
+                    <w:alias w:val="T_CODE"/>
+                    <w:tag w:val="T_CODE"/>
+                    <w:id w:val="510009"/>
+                  </w:sdtPr>
+                  <w:sdtContent>
+                    <w:r>
+                      <w:rPr>
+                        <w:rFonts w:ascii="Times New Roman" w:hAnsi="Times New Roman"/>
+                        <w:sz w:val="20"/>
+                      </w:rPr>
+                      <w:t xml:space="preserve"/>
+                    </w:r>
+                  </w:sdtContent>
+                </w:sdt>
+              </w:p>
+            </w:tc>
+            <w:tc>
+              <w:tcPr>
+                <w:tcW w:w="1347" w:type="dxa"/>
+                <w:tcMar>
+                  <w:top w:w="28" w:type="dxa"/>
+                  <w:left w:w="38" w:type="dxa"/>
+                  <w:bottom w:w="28" w:type="dxa"/>
+                  <w:right w:w="38" w:type="dxa"/>
+                </w:tcMar>
+                <w:vAlign w:val="center"/>
+              </w:tcPr>
+              <w:p>
+                <w:sdt>
+                  <w:sdtPr>
+                    <w:alias w:val="T_AXIS"/>
+                    <w:tag w:val="T_AXIS"/>
+                    <w:id w:val="510010"/>
+                  </w:sdtPr>
+                  <w:sdtContent>
+                    <w:r>
+                      <w:rPr>
+                        <w:rFonts w:ascii="Times New Roman" w:hAnsi="Times New Roman"/>
+                        <w:sz w:val="20"/>
+                      </w:rPr>
+                      <w:t xml:space="preserve"/>
+                    </w:r>
+                  </w:sdtContent>
+                </w:sdt>
+              </w:p>
+            </w:tc>
+            <w:tc>
+              <w:tcPr>
+                <w:tcW w:w="1347" w:type="dxa"/>
+                <w:tcMar>
+                  <w:top w:w="28" w:type="dxa"/>
+                  <w:left w:w="38" w:type="dxa"/>
+                  <w:bottom w:w="28" w:type="dxa"/>
+                  <w:right w:w="38" w:type="dxa"/>
+                </w:tcMar>
+                <w:vAlign w:val="center"/>
+              </w:tcPr>
+              <w:p>
+                <w:sdt>
+                  <w:sdtPr>
+                    <w:alias w:val="T_ROLE"/>
+                    <w:tag w:val="T_ROLE"/>
+                    <w:id w:val="510011"/>
+                  </w:sdtPr>
+                  <w:sdtContent>
+                    <w:r>
+                      <w:rPr>
+                        <w:rFonts w:ascii="Times New Roman" w:hAnsi="Times New Roman"/>
+                        <w:sz w:val="20"/>
+                      </w:rPr>
+                      <w:t xml:space="preserve"/>
+                    </w:r>
+                  </w:sdtContent>
+                </w:sdt>
+              </w:p>
+            </w:tc>
+            <w:tc>
+              <w:tcPr>
+                <w:tcW w:w="1347" w:type="dxa"/>
+                <w:gridSpan w:val="2"/>
+                <w:tcMar>
+                  <w:top w:w="28" w:type="dxa"/>
+                  <w:left w:w="38" w:type="dxa"/>
+                  <w:bottom w:w="28" w:type="dxa"/>
+                  <w:right w:w="38" w:type="dxa"/>
+                </w:tcMar>
+                <w:vAlign w:val="center"/>
+              </w:tcPr>
+              <w:p>
+                <w:sdt>
+                  <w:sdtPr>
+                    <w:alias w:val="T_WEIGHT"/>
+                    <w:tag w:val="T_WEIGHT"/>
+                    <w:id w:val="510012"/>
+                  </w:sdtPr>
+                  <w:sdtContent>
+                    <w:r>
+                      <w:rPr>
+                        <w:rFonts w:ascii="Times New Roman" w:hAnsi="Times New Roman"/>
+                        <w:sz w:val="20"/>
+                      </w:rPr>
+                      <w:t xml:space="preserve">«T_WEIGHT»</w:t>
+                    </w:r>
+                  </w:sdtContent>
+                </w:sdt>
+              </w:p>
+            </w:tc>
+            <w:tc>
+              <w:tcPr>
+                <w:tcW w:w="1347" w:type="dxa"/>
+                <w:tcMar>
+                  <w:top w:w="28" w:type="dxa"/>
+                  <w:left w:w="38" w:type="dxa"/>
+                  <w:bottom w:w="28" w:type="dxa"/>
+                  <w:right w:w="38" w:type="dxa"/>
+                </w:tcMar>
+                <w:vAlign w:val="center"/>
+              </w:tcPr>
+              <w:p>
+                <w:sdt>
+                  <w:sdtPr>
+                    <w:alias w:val="T_DEADLINE"/>
+                    <w:tag w:val="T_DEADLINE"/>
+                    <w:id w:val="510013"/>
+                  </w:sdtPr>
+                  <w:sdtContent>
+                    <w:r>
+                      <w:rPr>
+                        <w:rFonts w:ascii="Times New Roman" w:hAnsi="Times New Roman"/>
+                        <w:sz w:val="20"/>
+                      </w:rPr>
+                      <w:t xml:space="preserve">«T_DEADLINE»</w:t>
+                    </w:r>
+                  </w:sdtContent>
+                </w:sdt>
+              </w:p>
+            </w:tc>
+            <w:tc>
+              <w:tcPr>
+                <w:tcW w:w="1463" w:type="dxa"/>
+                <w:tcMar>
+                  <w:top w:w="28" w:type="dxa"/>
+                  <w:left w:w="38" w:type="dxa"/>
+                  <w:bottom w:w="28" w:type="dxa"/>
+                  <w:right w:w="38" w:type="dxa"/>
+                </w:tcMar>
+                <w:vAlign w:val="center"/>
+              </w:tcPr>
+              <w:p>
+                <w:sdt>
+                  <w:sdtPr>
+                    <w:alias w:val="T_STANDARD"/>
+                    <w:tag w:val="T_STANDARD"/>
+                    <w:id w:val="510014"/>
+                  </w:sdtPr>
+                  <w:sdtContent>
+                    <w:r>
+                      <w:rPr>
+                        <w:rFonts w:ascii="Times New Roman" w:hAnsi="Times New Roman"/>
+                        <w:sz w:val="20"/>
+                      </w:rPr>
+                      <w:t xml:space="preserve">Đạt chuẩn kỹ thuật được giao</w:t>
+                    </w:r>
+                  </w:sdtContent>
+                </w:sdt>
+              </w:p>
+            </w:tc>
+            <w:tc>
+              <w:tcPr>
+                <w:tcW w:w="1395" w:type="dxa"/>
+                <w:gridSpan w:val="2"/>
+                <w:tcMar>
+                  <w:top w:w="28" w:type="dxa"/>
+                  <w:left w:w="38" w:type="dxa"/>
+                  <w:bottom w:w="28" w:type="dxa"/>
+                  <w:right w:w="38" w:type="dxa"/>
+                </w:tcMar>
+                <w:vAlign w:val="center"/>
+              </w:tcPr>
+              <w:p>
+                <w:sdt>
+                  <w:sdtPr>
+                    <w:alias w:val="T_EXCEED"/>
+                    <w:tag w:val="T_EXCEED"/>
+                    <w:id w:val="510015"/>
+                  </w:sdtPr>
+                  <w:sdtContent>
+                    <w:r>
+                      <w:rPr>
+                        <w:rFonts w:ascii="Times New Roman" w:hAnsi="Times New Roman"/>
+                        <w:sz w:val="20"/>
+                      </w:rPr>
+                      <w:t xml:space="preserve">Vượt tiến độ / chất lượng xuất sắc</w:t>
+                    </w:r>
+                  </w:sdtContent>
+                </w:sdt>
+              </w:p>
+            </w:tc>
+            <w:tc>
+              <w:tcPr>
+                <w:tcW w:w="1347" w:type="dxa"/>
+                <w:tcMar>
+                  <w:top w:w="28" w:type="dxa"/>
+                  <w:left w:w="38" w:type="dxa"/>
+                  <w:bottom w:w="28" w:type="dxa"/>
+                  <w:right w:w="38" w:type="dxa"/>
+                </w:tcMar>
+                <w:vAlign w:val="center"/>
+              </w:tcPr>
+              <w:p>
+                <w:sdt>
+                  <w:sdtPr>
+                    <w:alias w:val="T_EVIDENCE"/>
+                    <w:tag w:val="T_EVIDENCE"/>
+                    <w:id w:val="510016"/>
+                  </w:sdtPr>
+                  <w:sdtContent>
+                    <w:r>
+                      <w:rPr>
+                        <w:rFonts w:ascii="Times New Roman" w:hAnsi="Times New Roman"/>
+                        <w:sz w:val="20"/>
+                      </w:rPr>
+                      <w:t xml:space="preserve">Biên bản nghiệm thu / Sản phẩm</w:t>
+                    </w:r>
+                  </w:sdtContent>
+                </w:sdt>
+              </w:p>
+            </w:tc>
+            <w:tc>
+              <w:tcPr>
+                <w:tcW w:w="1348" w:type="dxa"/>
+                <w:gridSpan w:val="2"/>
+                <w:tcMar>
+                  <w:top w:w="28" w:type="dxa"/>
+                  <w:left w:w="38" w:type="dxa"/>
+                  <w:bottom w:w="28" w:type="dxa"/>
+                  <w:right w:w="38" w:type="dxa"/>
+                </w:tcMar>
+                <w:vAlign w:val="center"/>
+              </w:tcPr>
+              <w:p>
+                <w:sdt>
+                  <w:sdtPr>
+                    <w:alias w:val="T_SIGNER"/>
+                    <w:tag w:val="T_SIGNER"/>
+                    <w:id w:val="510017"/>
+                  </w:sdtPr>
+                  <w:sdtContent>
+                    <w:r>
+                      <w:rPr>
+                        <w:rFonts w:ascii="Times New Roman" w:hAnsi="Times New Roman"/>
+                        <w:sz w:val="20"/>
+                      </w:rPr>
+                      <w:t xml:space="preserve">Lãnh đạo đơn vị</w:t>
+                    </w:r>
+                  </w:sdtContent>
+                </w:sdt>
+              </w:p>
+            </w:tc>
+          </w:tr>
+        </w:sdtContent>
+      </w:sdt>
       <w:tr>
         <w:trPr>
           <w:cantSplit/>

</xml_diff>

<commit_message>
feat(T-80,T-81): cài đặt đơn vị và quản lý file mẫu Word theo phiên bản
- Bảng organization_settings (một bản ghi, có kiểu): tên Đảng bộ, tổ chức Đảng cấp trên, tên công ty,
  đơn vị chủ quản, tên viết tắt, địa danh, tên hệ thống; seed mặc định = chuỗi trước đây ghi cứng.
- API GET/PUT /api/settings/organization (+ /public cho trang đăng nhập), cache xóa khi sửa.
- ReportService: tiêu đề Excel 14/15, danh sách cán bộ, tên tệp, dòng địa danh lấy từ cài đặt;
  Word nhận tag đơn vị dùng chung ORG_* (template gốc thêm Content Control).
- Quyền system.settings.manage, system.templates.manage.
- Bảng word_template_versions + kho tệp; WordTemplateStore đọc phiên bản kích hoạt, không có thì file gốc.
- Kiểm tra file mẫu: .docx, magic bytes, dung lượng, mở OpenXML, tag lạ = lỗi, tag bắt buộc thiếu = cảnh báo,
  sinh thử với dữ liệu giả. API /api/templates (danh mục, lịch sử, kiểm tra, tải lên, kích hoạt, tải xuống).
- Test unit + tích hợp.
</commit_message>
<xml_diff>
--- a/backend/src/CongTacDang.Infrastructure/Templates/Word/Mau_01_PhieuGiaoNhiemVu.docx
+++ b/backend/src/CongTacDang.Infrastructure/Templates/Word/Mau_01_PhieuGiaoNhiemVu.docx
@@ -62,13 +62,22 @@
               <w:spacing w:after="0" w:line="240" w:lineRule="auto"/>
               <w:jc w:val="center"/>
             </w:pPr>
-            <w:r>
-              <w:rPr>
-                <w:b/>
-                <w:sz w:val="24"/>
-              </w:rPr>
-              <w:t>CƠ QUAN QUẢN LÝ CẤP TRÊN</w:t>
-            </w:r>
+            <w:sdt>
+              <w:sdtPr>
+                <w:alias w:val="ORG_COMPANY_NAME_UPPER"/>
+                <w:tag w:val="ORG_COMPANY_NAME_UPPER"/>
+                <w:id w:val="531001"/>
+              </w:sdtPr>
+              <w:sdtContent>
+                <w:r>
+                  <w:rPr>
+                    <w:b/>
+                    <w:sz w:val="24"/>
+                  </w:rPr>
+                  <w:t>CƠ QUAN QUẢN LÝ CẤP TRÊN</w:t>
+                </w:r>
+              </w:sdtContent>
+            </w:sdt>
             <w:r>
               <w:rPr>
                 <w:b/>
@@ -133,12 +142,28 @@
               </w:rPr>
               <w:br/>
             </w:r>
+            <w:sdt>
+              <w:sdtPr>
+                <w:alias w:val="ORG_LOCATION"/>
+                <w:tag w:val="ORG_LOCATION"/>
+                <w:id w:val="531002"/>
+              </w:sdtPr>
+              <w:sdtContent>
+                <w:r>
+                  <w:rPr>
+                    <w:bCs/>
+                    <w:sz w:val="24"/>
+                  </w:rPr>
+                  <w:t>……</w:t>
+                </w:r>
+              </w:sdtContent>
+            </w:sdt>
             <w:r>
               <w:rPr>
                 <w:bCs/>
                 <w:sz w:val="24"/>
               </w:rPr>
-              <w:t>……, ngày …… tháng …… năm 20…</w:t>
+              <w:t xml:space="preserve">, ngày …… tháng …… năm 20…</w:t>
             </w:r>
           </w:p>
         </w:tc>

</xml_diff>

<commit_message>
fix(bieu-mau): bản in mọi biểu mẫu gọn, đúng thể thức — tên Đảng bộ dài ngắt hai dòng cân nhau và căn giữa (07, 08, 12, 13, 16, QĐ); chữ đỏ của biểu mẫu gốc in đen (09B, 9D, 10, 11); ô bảng hẹp không giãn chữ; khối chữ ký không tách trang, đi liền nội dung trước; bỏ trang trắng thừa Mẫu 11; Mẫu 01 đặt Lưu ý trước chữ ký; Mẫu 02 điền tổng điểm và số SP vượt chuẩn ở dòng CỘNG; Mẫu 01, 02, 09A ghi quý số La Mã
</commit_message>
<xml_diff>
--- a/backend/src/CongTacDang.Infrastructure/Templates/Word/Mau_01_PhieuGiaoNhiemVu.docx
+++ b/backend/src/CongTacDang.Infrastructure/Templates/Word/Mau_01_PhieuGiaoNhiemVu.docx
@@ -1405,6 +1405,39 @@
       </w:tr>
       <w:tr>
         <w:trPr>
+          <w:cantSplit/>
+          <w:jc w:val="center"/>
+        </w:trPr>
+        <w:tc>
+          <w:tcPr>
+            <w:tcW w:w="15398" w:type="dxa"/>
+            <w:gridSpan w:val="15"/>
+            <w:shd w:val="clear" w:color="auto" w:fill="FFFFFF"/>
+            <w:tcMar>
+              <w:top w:w="28" w:type="dxa"/>
+              <w:left w:w="38" w:type="dxa"/>
+              <w:bottom w:w="28" w:type="dxa"/>
+              <w:right w:w="38" w:type="dxa"/>
+            </w:tcMar>
+            <w:vAlign w:val="center"/>
+          </w:tcPr>
+          <w:p>
+            <w:pPr>
+              <w:shd w:val="clear" w:color="auto" w:fill="FFFFFF"/>
+              <w:spacing w:after="0" w:line="228" w:lineRule="auto"/>
+              <w:jc w:val="left"/>
+            </w:pPr>
+            <w:r>
+              <w:rPr>
+                <w:sz w:val="24"/>
+              </w:rPr>
+              <w:t>Lưu ý: Mọi điểm số/mức nhận xét phải có minh chứng; tiêu chí không áp dụng ghi “K/AD” và xử lý trọng số theo Hướng dẫn; không tính trùng cùng một kết quả ở nhiều tiêu chí; phần điều chỉnh sau hiệu chuẩn phải nêu rõ căn cứ.</w:t>
+            </w:r>
+          </w:p>
+        </w:tc>
+      </w:tr>
+      <w:tr>
+        <w:trPr>
           <w:gridAfter w:val="1"/>
           <w:wAfter w:w="13" w:type="dxa"/>
           <w:cantSplit/>
@@ -1571,39 +1604,6 @@
               </w:rPr>
               <w:br/>
               <w:t>(Ký, ghi rõ họ tên)</w:t>
-            </w:r>
-          </w:p>
-        </w:tc>
-      </w:tr>
-      <w:tr>
-        <w:trPr>
-          <w:cantSplit/>
-          <w:jc w:val="center"/>
-        </w:trPr>
-        <w:tc>
-          <w:tcPr>
-            <w:tcW w:w="15398" w:type="dxa"/>
-            <w:gridSpan w:val="15"/>
-            <w:shd w:val="clear" w:color="auto" w:fill="FFFFFF"/>
-            <w:tcMar>
-              <w:top w:w="28" w:type="dxa"/>
-              <w:left w:w="38" w:type="dxa"/>
-              <w:bottom w:w="28" w:type="dxa"/>
-              <w:right w:w="38" w:type="dxa"/>
-            </w:tcMar>
-            <w:vAlign w:val="center"/>
-          </w:tcPr>
-          <w:p>
-            <w:pPr>
-              <w:shd w:val="clear" w:color="auto" w:fill="FFFFFF"/>
-              <w:spacing w:after="0" w:line="228" w:lineRule="auto"/>
-              <w:jc w:val="left"/>
-            </w:pPr>
-            <w:r>
-              <w:rPr>
-                <w:sz w:val="24"/>
-              </w:rPr>
-              <w:t>Lưu ý: Mọi điểm số/mức nhận xét phải có minh chứng; tiêu chí không áp dụng ghi “K/AD” và xử lý trọng số theo Hướng dẫn; không tính trùng cùng một kết quả ở nhiều tiêu chí; phần điều chỉnh sau hiệu chuẩn phải nêu rõ căn cứ.</w:t>
             </w:r>
           </w:p>
         </w:tc>

</xml_diff>